<commit_message>
Se corrige la rotacion del banner con movimiento reducido y se agrega pausa, guia de uso desplegable en los indicadores, pictogramas propios en la portada de Indicadores, portadas de publicaciones a la misma altura, Tanques mas angosto y Publicaciones en el menu tematico en lugar de Innovacion
</commit_message>
<xml_diff>
--- a/public/data/indicadores/capital-humano-wb/textos/capital-humano.docx
+++ b/public/data/indicadores/capital-humano-wb/textos/capital-humano.docx
@@ -29,39 +29,7 @@
           <w:rFonts w:cs="Times New Roman"/>
           <w:lang w:val="es-ES"/>
         </w:rPr>
-        <w:t xml:space="preserve">El Human Capital </w:t>
-      </w:r>
-      <w:proofErr w:type="spellStart"/>
-      <w:r>
-        <w:rPr>
-          <w:rFonts w:cs="Times New Roman"/>
-          <w:lang w:val="es-ES"/>
-        </w:rPr>
-        <w:t>Index</w:t>
-      </w:r>
-      <w:proofErr w:type="spellEnd"/>
-      <w:r>
-        <w:rPr>
-          <w:rFonts w:cs="Times New Roman"/>
-          <w:lang w:val="es-ES"/>
-        </w:rPr>
-        <w:t xml:space="preserve"> (HCI) del Banco Mundial sintetiza la contribución esperada de la salud y la educación a la capacidad productiva futura de una persona. Su escala de 0 a 1 aproxima cuánto capital humano podría alcanzar un niño nacido en las condiciones actuales frente a un referente de educación completa y salud plena. El tablero integra, además, indicadores identificados en la base como Human Capital </w:t>
-      </w:r>
-      <w:proofErr w:type="spellStart"/>
-      <w:r>
-        <w:rPr>
-          <w:rFonts w:cs="Times New Roman"/>
-          <w:lang w:val="es-ES"/>
-        </w:rPr>
-        <w:t>Index</w:t>
-      </w:r>
-      <w:proofErr w:type="spellEnd"/>
-      <w:r>
-        <w:rPr>
-          <w:rFonts w:cs="Times New Roman"/>
-          <w:lang w:val="es-ES"/>
-        </w:rPr>
-        <w:t xml:space="preserve"> Plus (HCI+), mediante los cuales se observan el puntaje ampliado, los componentes de educación, empleo y aprendizaje continuo, salud y nutrición, las diferencias entre mujeres y hombres y las brechas frente a valores de referencia. De esta manera, la medición reúne resultados de formación, supervivencia, salud y participación a lo largo del ciclo de vida </w:t>
+        <w:t xml:space="preserve">El Índice de Capital Humano del Banco Mundial resume, en una escala de 0 a 1, cuánto capital humano puede alcanzar un niño nacido hoy gracias a su salud y su educación. Este visualizador amplía esa lectura con los componentes del índice extendido (HCI+): educación, empleo y aprendizaje continuo, salud y nutrición, brechas de género y distancia frente al máximo, con escenarios de futuro para Colombia y los países disponibles.</w:t>
       </w:r>
     </w:p>
     <w:p>
@@ -75,50 +43,18 @@
       </w:pPr>
       <w:r>
         <w:rPr>
+          <w:b/>
           <w:rFonts w:cs="Times New Roman"/>
-          <w:b/>
           <w:lang w:val="es-ES"/>
         </w:rPr>
-        <w:t xml:space="preserve">Uso del visualizador. </w:t>
+        <w:t xml:space="preserve">Cómo usar el visualizador. </w:t>
       </w:r>
       <w:r>
         <w:rPr>
           <w:rFonts w:cs="Times New Roman"/>
           <w:lang w:val="es-ES"/>
         </w:rPr>
-        <w:t xml:space="preserve">El cuaderno se abre en Google </w:t>
-      </w:r>
-      <w:proofErr w:type="spellStart"/>
-      <w:r>
-        <w:rPr>
-          <w:rFonts w:cs="Times New Roman"/>
-          <w:lang w:val="es-ES"/>
-        </w:rPr>
-        <w:t>Colab</w:t>
-      </w:r>
-      <w:proofErr w:type="spellEnd"/>
-      <w:r>
-        <w:rPr>
-          <w:rFonts w:cs="Times New Roman"/>
-          <w:lang w:val="es-ES"/>
-        </w:rPr>
-        <w:t xml:space="preserve"> y se ejecuta por celdas; la base de datos se encuentra incorporada en formato comprimido, por lo que no requiere una carga externa adicional. El selector desplegable permite cambiar entre el índice equivalente, el índice tradicional, la brecha de género, la brecha frente al máximo y los demás componentes de capital humano. La leyenda permite activar o desactivar escenarios, mientras el cursor muestra año, valor, unidad y tipo de dato. Los controles de </w:t>
-      </w:r>
-      <w:proofErr w:type="spellStart"/>
-      <w:r>
-        <w:rPr>
-          <w:rFonts w:cs="Times New Roman"/>
-          <w:lang w:val="es-ES"/>
-        </w:rPr>
-        <w:t>Plotly</w:t>
-      </w:r>
-      <w:proofErr w:type="spellEnd"/>
-      <w:r>
-        <w:rPr>
-          <w:rFonts w:cs="Times New Roman"/>
-          <w:lang w:val="es-ES"/>
-        </w:rPr>
-        <w:t xml:space="preserve"> habilitan zoom, desplazamiento y descarga en PNG. El cuaderno incluye también módulos para seguir la evolución de Colombia y realizar comparaciones internacionales entre los países disponibles.</w:t>
+        <w:t xml:space="preserve">Elija en el desplegable el indicador que quiere seguir (índice equivalente, índice tradicional, brecha de género, brecha frente al máximo o cualquiera de los componentes) y observe su historia junto a los tres escenarios prospectivos. Active o apague escenarios desde la leyenda y pase el cursor sobre cada punto para leer año, valor y tipo de dato.</w:t>
       </w:r>
     </w:p>
     <w:p>

</xml_diff>